<commit_message>
Deploy actual plant disease prediction app
</commit_message>
<xml_diff>
--- a/docs/plant_disease_report_KIIT.docx
+++ b/docs/plant_disease_report_KIIT.docx
@@ -177,7 +177,7 @@
         <w:rPr>
           <w:color w:val="000000"/>
         </w:rPr>
-        <w:t>[ROLL NUMBER]</w:t>
+        <w:t>2306341</w:t>
       </w:r>
     </w:p>
     <w:p>
@@ -205,7 +205,7 @@
           <w:bCs/>
           <w:color w:val="000000"/>
         </w:rPr>
-        <w:t>[GUIDE NAME]</w:t>
+        <w:t>Anjan Bandopadhyay</w:t>
       </w:r>
     </w:p>
     <w:p>
@@ -369,13 +369,31 @@
         <w:spacing w:after="40" w:line="360" w:lineRule="auto"/>
         <w:jc w:val="center"/>
       </w:pPr>
+      <w:proofErr w:type="gramStart"/>
       <w:r>
         <w:rPr>
           <w:b/>
           <w:bCs/>
           <w:color w:val="000000"/>
         </w:rPr>
-        <w:t>SREE HARSHITHA</w:t>
+        <w:t>P.</w:t>
+      </w:r>
+      <w:r>
+        <w:rPr>
+          <w:b/>
+          <w:bCs/>
+          <w:color w:val="000000"/>
+        </w:rPr>
+        <w:t>SREE</w:t>
+      </w:r>
+      <w:proofErr w:type="gramEnd"/>
+      <w:r>
+        <w:rPr>
+          <w:b/>
+          <w:bCs/>
+          <w:color w:val="000000"/>
+        </w:rPr>
+        <w:t xml:space="preserve"> HARSHITHA</w:t>
       </w:r>
     </w:p>
     <w:p>
@@ -387,7 +405,7 @@
         <w:rPr>
           <w:color w:val="000000"/>
         </w:rPr>
-        <w:t>[ROLL NUMBER]</w:t>
+        <w:t>2306341</w:t>
       </w:r>
     </w:p>
     <w:p>
@@ -435,7 +453,19 @@
         <w:rPr>
           <w:color w:val="000000"/>
         </w:rPr>
-        <w:t>([Guide Name])</w:t>
+        <w:t>(</w:t>
+      </w:r>
+      <w:r>
+        <w:rPr>
+          <w:color w:val="000000"/>
+        </w:rPr>
+        <w:t>Anjan Bandopadhyay</w:t>
+      </w:r>
+      <w:r>
+        <w:rPr>
+          <w:color w:val="000000"/>
+        </w:rPr>
+        <w:t>)</w:t>
       </w:r>
     </w:p>
     <w:p>
@@ -480,7 +510,19 @@
         <w:rPr>
           <w:color w:val="000000"/>
         </w:rPr>
-        <w:t>We are profoundly grateful to [GUIDE NAME] of School of Computer Engineering, KIIT University for expert guidance and continuous encouragement throughout to see that this project reaches its target since its commencement to its completion.</w:t>
+        <w:t xml:space="preserve">We are profoundly grateful to </w:t>
+      </w:r>
+      <w:r>
+        <w:rPr>
+          <w:color w:val="000000"/>
+        </w:rPr>
+        <w:t>Anjan Bandopadhyay</w:t>
+      </w:r>
+      <w:r>
+        <w:rPr>
+          <w:color w:val="000000"/>
+        </w:rPr>
+        <w:t xml:space="preserve"> of School of Computer Engineering, KIIT University for expert guidance and continuous encouragement throughout to see that this project reaches its target since its commencement to its completion.</w:t>
       </w:r>
     </w:p>
     <w:p>
@@ -3456,16 +3498,7 @@
         <w:t xml:space="preserve"> </w:t>
       </w:r>
       <w:r>
-        <w:t>(P</w:t>
-      </w:r>
-      <w:r>
-        <w:t>EP</w:t>
-      </w:r>
-      <w:r>
-        <w:t>)</w:t>
-      </w:r>
-      <w:r>
-        <w:t xml:space="preserve"> 8 Python style guide for code formatting and naming conventions</w:t>
+        <w:t>(PEP) 8 Python style guide for code formatting and naming conventions</w:t>
       </w:r>
     </w:p>
     <w:p>
@@ -5044,6 +5077,7 @@
   <w:style w:type="character" w:default="1" w:styleId="DefaultParagraphFont">
     <w:name w:val="Default Paragraph Font"/>
     <w:uiPriority w:val="1"/>
+    <w:semiHidden/>
     <w:unhideWhenUsed/>
   </w:style>
   <w:style w:type="table" w:default="1" w:styleId="TableNormal">

</xml_diff>

<commit_message>
Add SmartPlantAdvisor class and prediction logging functionality
- Implemented SmartPlantAdvisor class for diagnosing plant health based on sensor data.
- Added methods for preparing data, predicting status, and generating recommendations.
- Introduced logging of predictions to a CSV file for monitoring purposes.
- Created feature profiles and normalized weights for model predictions.
- Included localization support for display names and action recommendations in English and Hindi.
- Established a structured approach for handling sensor issues and risk assessment.
</commit_message>
<xml_diff>
--- a/docs/plant_disease_report_KIIT.docx
+++ b/docs/plant_disease_report_KIIT.docx
@@ -177,7 +177,7 @@
         <w:rPr>
           <w:color w:val="000000"/>
         </w:rPr>
-        <w:t>[ROLL NUMBER]</w:t>
+        <w:t>2306341</w:t>
       </w:r>
     </w:p>
     <w:p>
@@ -205,7 +205,7 @@
           <w:bCs/>
           <w:color w:val="000000"/>
         </w:rPr>
-        <w:t>[GUIDE NAME]</w:t>
+        <w:t>Anjan Bandopadhyay</w:t>
       </w:r>
     </w:p>
     <w:p>
@@ -369,13 +369,31 @@
         <w:spacing w:after="40" w:line="360" w:lineRule="auto"/>
         <w:jc w:val="center"/>
       </w:pPr>
+      <w:proofErr w:type="gramStart"/>
       <w:r>
         <w:rPr>
           <w:b/>
           <w:bCs/>
           <w:color w:val="000000"/>
         </w:rPr>
-        <w:t>SREE HARSHITHA</w:t>
+        <w:t>P.</w:t>
+      </w:r>
+      <w:r>
+        <w:rPr>
+          <w:b/>
+          <w:bCs/>
+          <w:color w:val="000000"/>
+        </w:rPr>
+        <w:t>SREE</w:t>
+      </w:r>
+      <w:proofErr w:type="gramEnd"/>
+      <w:r>
+        <w:rPr>
+          <w:b/>
+          <w:bCs/>
+          <w:color w:val="000000"/>
+        </w:rPr>
+        <w:t xml:space="preserve"> HARSHITHA</w:t>
       </w:r>
     </w:p>
     <w:p>
@@ -387,7 +405,7 @@
         <w:rPr>
           <w:color w:val="000000"/>
         </w:rPr>
-        <w:t>[ROLL NUMBER]</w:t>
+        <w:t>2306341</w:t>
       </w:r>
     </w:p>
     <w:p>
@@ -435,7 +453,19 @@
         <w:rPr>
           <w:color w:val="000000"/>
         </w:rPr>
-        <w:t>([Guide Name])</w:t>
+        <w:t>(</w:t>
+      </w:r>
+      <w:r>
+        <w:rPr>
+          <w:color w:val="000000"/>
+        </w:rPr>
+        <w:t>Anjan Bandopadhyay</w:t>
+      </w:r>
+      <w:r>
+        <w:rPr>
+          <w:color w:val="000000"/>
+        </w:rPr>
+        <w:t>)</w:t>
       </w:r>
     </w:p>
     <w:p>
@@ -480,7 +510,19 @@
         <w:rPr>
           <w:color w:val="000000"/>
         </w:rPr>
-        <w:t>We are profoundly grateful to [GUIDE NAME] of School of Computer Engineering, KIIT University for expert guidance and continuous encouragement throughout to see that this project reaches its target since its commencement to its completion.</w:t>
+        <w:t xml:space="preserve">We are profoundly grateful to </w:t>
+      </w:r>
+      <w:r>
+        <w:rPr>
+          <w:color w:val="000000"/>
+        </w:rPr>
+        <w:t>Anjan Bandopadhyay</w:t>
+      </w:r>
+      <w:r>
+        <w:rPr>
+          <w:color w:val="000000"/>
+        </w:rPr>
+        <w:t xml:space="preserve"> of School of Computer Engineering, KIIT University for expert guidance and continuous encouragement throughout to see that this project reaches its target since its commencement to its completion.</w:t>
       </w:r>
     </w:p>
     <w:p>
@@ -3456,16 +3498,7 @@
         <w:t xml:space="preserve"> </w:t>
       </w:r>
       <w:r>
-        <w:t>(P</w:t>
-      </w:r>
-      <w:r>
-        <w:t>EP</w:t>
-      </w:r>
-      <w:r>
-        <w:t>)</w:t>
-      </w:r>
-      <w:r>
-        <w:t xml:space="preserve"> 8 Python style guide for code formatting and naming conventions</w:t>
+        <w:t>(PEP) 8 Python style guide for code formatting and naming conventions</w:t>
       </w:r>
     </w:p>
     <w:p>
@@ -5044,6 +5077,7 @@
   <w:style w:type="character" w:default="1" w:styleId="DefaultParagraphFont">
     <w:name w:val="Default Paragraph Font"/>
     <w:uiPriority w:val="1"/>
+    <w:semiHidden/>
     <w:unhideWhenUsed/>
   </w:style>
   <w:style w:type="table" w:default="1" w:styleId="TableNormal">

</xml_diff>